<commit_message>
IG Heiiu: familia LO QUE NADIE TE DICE (12 tarjetas oscuras + trampas agencias + manifiesto compromiso) intercalada - cronograma 55 posts
Co-Authored-By: Claude Fable 5 <noreply@anthropic.com>
</commit_message>
<xml_diff>
--- a/recursos/comercial/campañas/IG_HEIIU/COPIES_HEIIU.docx
+++ b/recursos/comercial/campañas/IG_HEIIU/COPIES_HEIIU.docx
@@ -112,7 +112,34 @@
           <w:color w:val="33261A"/>
           <w:sz w:val="23"/>
         </w:rPr>
-        <w:t>POST 03 (T) — Frase del dia 1</w:t>
+        <w:t>POST 03 (C) — La flexibilidad no te hara hablar</w:t>
+      </w:r>
+    </w:p>
+    <w:p>
+      <w:r>
+        <w:rPr>
+          <w:color w:val="8A7A6A"/>
+          <w:sz w:val="20"/>
+        </w:rPr>
+        <w:t>#ingles #aprendeingles #inglesbucaramanga #bucaramanga #academiadeingles</w:t>
+      </w:r>
+    </w:p>
+    <w:p>
+      <w:r>
+        <w:rPr>
+          <w:sz w:val="22"/>
+        </w:rPr>
+        <w:t>El 88% abandona la app antes del primer mes (retención día 30 de Duolingo: 12% — Udonis). La flexibilidad vende; el compromiso enseña. Si buscas hablar de verdad, escríbenos.</w:t>
+      </w:r>
+    </w:p>
+    <w:p>
+      <w:r>
+        <w:rPr>
+          <w:b/>
+          <w:color w:val="33261A"/>
+          <w:sz w:val="23"/>
+        </w:rPr>
+        <w:t>POST 04 (T) — Frase del dia 1</w:t>
       </w:r>
     </w:p>
     <w:p>
@@ -139,7 +166,34 @@
           <w:color w:val="33261A"/>
           <w:sz w:val="23"/>
         </w:rPr>
-        <w:t>POST 04 (C) — Deja de traducir Ep1 pues</w:t>
+        <w:t>POST 05 (N) — El ingles es un pasaporte</w:t>
+      </w:r>
+    </w:p>
+    <w:p>
+      <w:r>
+        <w:rPr>
+          <w:color w:val="8A7A6A"/>
+          <w:sz w:val="20"/>
+        </w:rPr>
+        <w:t>#ingles #aprendeingles #inglesbucaramanga #bucaramanga #academiadeingles</w:t>
+      </w:r>
+    </w:p>
+    <w:p>
+      <w:r>
+        <w:rPr>
+          <w:sz w:val="22"/>
+        </w:rPr>
+        <w:t>Las puertas existen: Au Pair, Work and Travel, H2B. El precio de entrada no es el tiquete: es el inglés. Escribe AUPAIR si quieres saber dónde estás.</w:t>
+      </w:r>
+    </w:p>
+    <w:p>
+      <w:r>
+        <w:rPr>
+          <w:b/>
+          <w:color w:val="33261A"/>
+          <w:sz w:val="23"/>
+        </w:rPr>
+        <w:t>POST 06 (C) — Deja de traducir Ep1 pues</w:t>
       </w:r>
     </w:p>
     <w:p>
@@ -163,10 +217,20 @@
       <w:r>
         <w:rPr>
           <w:b/>
+          <w:color w:val="E54C09"/>
+          <w:sz w:val="25"/>
+        </w:rPr>
+        <w:t>SEMANA 2 — POST 07 a 15 (AuPair ruta + FAQ dentro de la ventana de promo)</w:t>
+      </w:r>
+    </w:p>
+    <w:p>
+      <w:r>
+        <w:rPr>
+          <w:b/>
           <w:color w:val="33261A"/>
           <w:sz w:val="23"/>
         </w:rPr>
-        <w:t>POST 05 (T) — I house</w:t>
+        <w:t>POST 07 (T) — I house</w:t>
       </w:r>
     </w:p>
     <w:p>
@@ -193,7 +257,7 @@
           <w:color w:val="33261A"/>
           <w:sz w:val="23"/>
         </w:rPr>
-        <w:t>POST 06 (T) — Frase del dia 2</w:t>
+        <w:t>POST 08 (N) — El 88 abandona la app</w:t>
       </w:r>
     </w:p>
     <w:p>
@@ -210,17 +274,7 @@
         <w:rPr>
           <w:sz w:val="22"/>
         </w:rPr>
-        <w:t>Inglés + criterio. Así se entrena aquí.</w:t>
-      </w:r>
-    </w:p>
-    <w:p>
-      <w:r>
-        <w:rPr>
-          <w:b/>
-          <w:color w:val="E54C09"/>
-          <w:sz w:val="25"/>
-        </w:rPr>
-        <w:t>SEMANA 2 — POST 07 a 15 (AuPair ruta + FAQ dentro de la ventana de promo)</w:t>
+        <w:t>Retención de las apps de inglés al día 30: un dígito (Duolingo: 12%, dato de industria — Udonis). No es tu disciplina: es que nadie aprende un idioma solo. Escríbenos y te contamos cómo se entrena de verdad.</w:t>
       </w:r>
     </w:p>
     <w:p>
@@ -230,7 +284,7 @@
           <w:color w:val="33261A"/>
           <w:sz w:val="23"/>
         </w:rPr>
-        <w:t>POST 07 (C) — AuPair ruta 7 meses</w:t>
+        <w:t>POST 09 (C) — AuPair ruta 7 meses</w:t>
       </w:r>
     </w:p>
     <w:p>
@@ -257,7 +311,88 @@
           <w:color w:val="33261A"/>
           <w:sz w:val="23"/>
         </w:rPr>
-        <w:t>POST 08 (T) — she father</w:t>
+        <w:t>POST 10 (T) — Frase del dia 2</w:t>
+      </w:r>
+    </w:p>
+    <w:p>
+      <w:r>
+        <w:rPr>
+          <w:color w:val="8A7A6A"/>
+          <w:sz w:val="20"/>
+        </w:rPr>
+        <w:t>#ingles #aprendeingles #inglesbucaramanga #bucaramanga #academiadeingles</w:t>
+      </w:r>
+    </w:p>
+    <w:p>
+      <w:r>
+        <w:rPr>
+          <w:sz w:val="22"/>
+        </w:rPr>
+        <w:t>Inglés + criterio. Así se entrena aquí.</w:t>
+      </w:r>
+    </w:p>
+    <w:p>
+      <w:r>
+        <w:rPr>
+          <w:b/>
+          <w:color w:val="33261A"/>
+          <w:sz w:val="23"/>
+        </w:rPr>
+        <w:t>POST 11 (N) — 16 muchachas en 2024</w:t>
+      </w:r>
+    </w:p>
+    <w:p>
+      <w:r>
+        <w:rPr>
+          <w:color w:val="8A7A6A"/>
+          <w:sz w:val="20"/>
+        </w:rPr>
+        <w:t>#ingles #aprendeingles #inglesbucaramanga #bucaramanga #academiadeingles</w:t>
+      </w:r>
+    </w:p>
+    <w:p>
+      <w:r>
+        <w:rPr>
+          <w:sz w:val="22"/>
+        </w:rPr>
+        <w:t>16 matrículas en 2024 con la misma meta. El programa pone la puerta; el inglés es la llave. Escribe AUPAIR.</w:t>
+      </w:r>
+    </w:p>
+    <w:p>
+      <w:r>
+        <w:rPr>
+          <w:b/>
+          <w:color w:val="33261A"/>
+          <w:sz w:val="23"/>
+        </w:rPr>
+        <w:t>POST 12 (C) — Deja de traducir Ep2 o sea</w:t>
+      </w:r>
+    </w:p>
+    <w:p>
+      <w:r>
+        <w:rPr>
+          <w:color w:val="8A7A6A"/>
+          <w:sz w:val="20"/>
+        </w:rPr>
+        <w:t>#ingles #aprendeingles #inglesbucaramanga #bucaramanga #academiadeingles</w:t>
+      </w:r>
+    </w:p>
+    <w:p>
+      <w:r>
+        <w:rPr>
+          <w:sz w:val="22"/>
+        </w:rPr>
+        <w:t>¿Cuántas veces dijiste "o sea" hoy? No es que no sepas inglés — estás traduciendo del español. Guarda el post y repite los reemplazos hoy. Aclaras como nativo, no como diccionario. Deja de traducir · Ep. 2 🎬 ¿Quieres dejar de traducir de verdad? Escríbenos — clase de cortesía.</w:t>
+      </w:r>
+    </w:p>
+    <w:p>
+      <w:r>
+        <w:rPr>
+          <w:b/>
+          <w:color w:val="33261A"/>
+          <w:sz w:val="23"/>
+        </w:rPr>
+        <w:t>POST 13 (T) — she father</w:t>
       </w:r>
     </w:p>
     <w:p>
@@ -284,7 +419,71 @@
           <w:color w:val="33261A"/>
           <w:sz w:val="23"/>
         </w:rPr>
-        <w:t>POST 09 (T) — Frase del dia 3</w:t>
+        <w:t>POST 14 (N) — 5 anios de colegio</w:t>
+      </w:r>
+    </w:p>
+    <w:p>
+      <w:r>
+        <w:rPr>
+          <w:color w:val="8A7A6A"/>
+          <w:sz w:val="20"/>
+        </w:rPr>
+        <w:t>#ingles #aprendeingles #inglesbucaramanga #bucaramanga #academiadeingles</w:t>
+      </w:r>
+    </w:p>
+    <w:p>
+      <w:r>
+        <w:rPr>
+          <w:sz w:val="22"/>
+        </w:rPr>
+        <w:t>Cinco años de colegio y el 'do you… ehh'. El problema nunca fuiste tú: fue el método sentado. Aquí se habla desde el día uno.</w:t>
+      </w:r>
+    </w:p>
+    <w:p>
+      <w:r>
+        <w:rPr>
+          <w:b/>
+          <w:color w:val="33261A"/>
+          <w:sz w:val="23"/>
+        </w:rPr>
+        <w:t>POST 15 (C) — Las 5 trampas de las agencias</w:t>
+      </w:r>
+    </w:p>
+    <w:p>
+      <w:r>
+        <w:rPr>
+          <w:color w:val="8A7A6A"/>
+          <w:sz w:val="20"/>
+        </w:rPr>
+        <w:t>#ingles #aprendeingles #inglesbucaramanga #bucaramanga #academiadeingles</w:t>
+      </w:r>
+    </w:p>
+    <w:p>
+      <w:r>
+        <w:rPr>
+          <w:sz w:val="22"/>
+        </w:rPr>
+        <w:t>Si una agencia te hace 2 o más de estas, corre 🏃‍♀️ Las puertas existen — pero solo las verificadas se cruzan. Escribe AUPAIR y te mostramos cómo se ve una puerta segura.</w:t>
+      </w:r>
+    </w:p>
+    <w:p>
+      <w:r>
+        <w:rPr>
+          <w:b/>
+          <w:color w:val="E54C09"/>
+          <w:sz w:val="25"/>
+        </w:rPr>
+        <w:t>RÉGIMEN — POST 16 en adelante: 1 por día programada</w:t>
+      </w:r>
+    </w:p>
+    <w:p>
+      <w:r>
+        <w:rPr>
+          <w:b/>
+          <w:color w:val="33261A"/>
+          <w:sz w:val="23"/>
+        </w:rPr>
+        <w:t>POST 16 (T) — Frase del dia 3</w:t>
       </w:r>
     </w:p>
     <w:p>
@@ -311,34 +510,7 @@
           <w:color w:val="33261A"/>
           <w:sz w:val="23"/>
         </w:rPr>
-        <w:t>POST 10 (C) — Deja de traducir Ep2 o sea</w:t>
-      </w:r>
-    </w:p>
-    <w:p>
-      <w:r>
-        <w:rPr>
-          <w:color w:val="8A7A6A"/>
-          <w:sz w:val="20"/>
-        </w:rPr>
-        <w:t>#ingles #aprendeingles #inglesbucaramanga #bucaramanga #academiadeingles</w:t>
-      </w:r>
-    </w:p>
-    <w:p>
-      <w:r>
-        <w:rPr>
-          <w:sz w:val="22"/>
-        </w:rPr>
-        <w:t>¿Cuántas veces dijiste "o sea" hoy? No es que no sepas inglés — estás traduciendo del español. Guarda el post y repite los reemplazos hoy. Aclaras como nativo, no como diccionario. Deja de traducir · Ep. 2 🎬 ¿Quieres dejar de traducir de verdad? Escríbenos — clase de cortesía.</w:t>
-      </w:r>
-    </w:p>
-    <w:p>
-      <w:r>
-        <w:rPr>
-          <w:b/>
-          <w:color w:val="33261A"/>
-          <w:sz w:val="23"/>
-        </w:rPr>
-        <w:t>POST 11 (T) — 25 old years</w:t>
+        <w:t>POST 17 (T) — 25 old years</w:t>
       </w:r>
     </w:p>
     <w:p>
@@ -365,7 +537,115 @@
           <w:color w:val="33261A"/>
           <w:sz w:val="23"/>
         </w:rPr>
-        <w:t>POST 12 (T) — Frase del dia 4</w:t>
+        <w:t>POST 18 (C) — AuPair FAQ</w:t>
+      </w:r>
+    </w:p>
+    <w:p>
+      <w:r>
+        <w:rPr>
+          <w:color w:val="8A7A6A"/>
+          <w:sz w:val="20"/>
+        </w:rPr>
+        <w:t>#ingles #aprendeingles #inglesbucaramanga #bucaramanga #academiadeingles</w:t>
+      </w:r>
+    </w:p>
+    <w:p>
+      <w:r>
+        <w:rPr>
+          <w:sz w:val="22"/>
+        </w:rPr>
+        <w:t>Las 4 preguntas que nos llegan cada semana, respondidas sin carreta ✅ Escribe AUPAIR y resuelve tu caso puntual — gratis.</w:t>
+      </w:r>
+    </w:p>
+    <w:p>
+      <w:r>
+        <w:rPr>
+          <w:b/>
+          <w:color w:val="33261A"/>
+          <w:sz w:val="23"/>
+        </w:rPr>
+        <w:t>POST 19 (N) — Te grabamos antes</w:t>
+      </w:r>
+    </w:p>
+    <w:p>
+      <w:r>
+        <w:rPr>
+          <w:color w:val="8A7A6A"/>
+          <w:sz w:val="20"/>
+        </w:rPr>
+        <w:t>#ingles #aprendeingles #inglesbucaramanga #bucaramanga #academiadeingles</w:t>
+      </w:r>
+    </w:p>
+    <w:p>
+      <w:r>
+        <w:rPr>
+          <w:sz w:val="22"/>
+        </w:rPr>
+        <w:t>Grabarte el día 1 da susto. Verte al mes 3 lo paga todo. Así se PRUEBA el avance — no con carteleras de niveles.</w:t>
+      </w:r>
+    </w:p>
+    <w:p>
+      <w:r>
+        <w:rPr>
+          <w:b/>
+          <w:color w:val="33261A"/>
+          <w:sz w:val="23"/>
+        </w:rPr>
+        <w:t>POST 20 (T) — She feel happy</w:t>
+      </w:r>
+    </w:p>
+    <w:p>
+      <w:r>
+        <w:rPr>
+          <w:color w:val="8A7A6A"/>
+          <w:sz w:val="20"/>
+        </w:rPr>
+        <w:t>#ingles #aprendeingles #inglesbucaramanga #bucaramanga #academiadeingles</w:t>
+      </w:r>
+    </w:p>
+    <w:p>
+      <w:r>
+        <w:rPr>
+          <w:sz w:val="22"/>
+        </w:rPr>
+        <w:t>Este lo escuchamos en un estudiante AVANZADO. Nadie está a salvo de la S.</w:t>
+      </w:r>
+    </w:p>
+    <w:p>
+      <w:r>
+        <w:rPr>
+          <w:b/>
+          <w:color w:val="33261A"/>
+          <w:sz w:val="23"/>
+        </w:rPr>
+        <w:t>POST 21 (C) — Deja de traducir Ep3 listo</w:t>
+      </w:r>
+    </w:p>
+    <w:p>
+      <w:r>
+        <w:rPr>
+          <w:color w:val="8A7A6A"/>
+          <w:sz w:val="20"/>
+        </w:rPr>
+        <w:t>#ingles #aprendeingles #inglesbucaramanga #bucaramanga #academiadeingles</w:t>
+      </w:r>
+    </w:p>
+    <w:p>
+      <w:r>
+        <w:rPr>
+          <w:sz w:val="22"/>
+        </w:rPr>
+        <w:t>¿Cuántas veces dijiste "listo" hoy? No es que no sepas inglés — estás traduciendo del español. Guarda el post y repite los reemplazos hoy. Cierras conversaciones como nativo. Deja de traducir · Ep. 3 🎬 ¿Quieres dejar de traducir de verdad? Escríbenos — clase de cortesía.</w:t>
+      </w:r>
+    </w:p>
+    <w:p>
+      <w:r>
+        <w:rPr>
+          <w:b/>
+          <w:color w:val="33261A"/>
+          <w:sz w:val="23"/>
+        </w:rPr>
+        <w:t>POST 22 (T) — Frase del dia 4</w:t>
       </w:r>
     </w:p>
     <w:p>
@@ -392,7 +672,7 @@
           <w:color w:val="33261A"/>
           <w:sz w:val="23"/>
         </w:rPr>
-        <w:t>POST 13 (C) — AuPair FAQ</w:t>
+        <w:t>POST 23 (N) — La flexibilidad es promesa de venta</w:t>
       </w:r>
     </w:p>
     <w:p>
@@ -409,7 +689,7 @@
         <w:rPr>
           <w:sz w:val="22"/>
         </w:rPr>
-        <w:t>Las 4 preguntas que nos llegan cada semana, respondidas sin carreta ✅ Escribe AUPAIR y resuelve tu caso puntual — gratis.</w:t>
+        <w:t>Piénsalo: ¿quién gana con tu "flexibilidad"? Tú ganas con tu constancia.</w:t>
       </w:r>
     </w:p>
     <w:p>
@@ -419,98 +699,7 @@
           <w:color w:val="33261A"/>
           <w:sz w:val="23"/>
         </w:rPr>
-        <w:t>POST 14 (T) — She feel happy</w:t>
-      </w:r>
-    </w:p>
-    <w:p>
-      <w:r>
-        <w:rPr>
-          <w:color w:val="8A7A6A"/>
-          <w:sz w:val="20"/>
-        </w:rPr>
-        <w:t>#ingles #aprendeingles #inglesbucaramanga #bucaramanga #academiadeingles</w:t>
-      </w:r>
-    </w:p>
-    <w:p>
-      <w:r>
-        <w:rPr>
-          <w:sz w:val="22"/>
-        </w:rPr>
-        <w:t>Este lo escuchamos en un estudiante AVANZADO. Nadie está a salvo de la S.</w:t>
-      </w:r>
-    </w:p>
-    <w:p>
-      <w:r>
-        <w:rPr>
-          <w:b/>
-          <w:color w:val="33261A"/>
-          <w:sz w:val="23"/>
-        </w:rPr>
-        <w:t>POST 15 (T) — Frase del dia 5</w:t>
-      </w:r>
-    </w:p>
-    <w:p>
-      <w:r>
-        <w:rPr>
-          <w:color w:val="8A7A6A"/>
-          <w:sz w:val="20"/>
-        </w:rPr>
-        <w:t>#ingles #aprendeingles #inglesbucaramanga #bucaramanga #academiadeingles</w:t>
-      </w:r>
-    </w:p>
-    <w:p>
-      <w:r>
-        <w:rPr>
-          <w:sz w:val="22"/>
-        </w:rPr>
-        <w:t>Ese DO no está de adorno: es énfasis. Nivel desbloqueado.</w:t>
-      </w:r>
-    </w:p>
-    <w:p>
-      <w:r>
-        <w:rPr>
-          <w:b/>
-          <w:color w:val="E54C09"/>
-          <w:sz w:val="25"/>
-        </w:rPr>
-        <w:t>RÉGIMEN — POST 16 en adelante: 1 por día programada</w:t>
-      </w:r>
-    </w:p>
-    <w:p>
-      <w:r>
-        <w:rPr>
-          <w:b/>
-          <w:color w:val="33261A"/>
-          <w:sz w:val="23"/>
-        </w:rPr>
-        <w:t>POST 16 (C) — Deja de traducir Ep3 listo</w:t>
-      </w:r>
-    </w:p>
-    <w:p>
-      <w:r>
-        <w:rPr>
-          <w:color w:val="8A7A6A"/>
-          <w:sz w:val="20"/>
-        </w:rPr>
-        <w:t>#ingles #aprendeingles #inglesbucaramanga #bucaramanga #academiadeingles</w:t>
-      </w:r>
-    </w:p>
-    <w:p>
-      <w:r>
-        <w:rPr>
-          <w:sz w:val="22"/>
-        </w:rPr>
-        <w:t>¿Cuántas veces dijiste "listo" hoy? No es que no sepas inglés — estás traduciendo del español. Guarda el post y repite los reemplazos hoy. Cierras conversaciones como nativo. Deja de traducir · Ep. 3 🎬 ¿Quieres dejar de traducir de verdad? Escríbenos — clase de cortesía.</w:t>
-      </w:r>
-    </w:p>
-    <w:p>
-      <w:r>
-        <w:rPr>
-          <w:b/>
-          <w:color w:val="33261A"/>
-          <w:sz w:val="23"/>
-        </w:rPr>
-        <w:t>POST 17 (T) — she work</w:t>
+        <w:t>POST 24 (T) — she work</w:t>
       </w:r>
     </w:p>
     <w:p>
@@ -537,7 +726,34 @@
           <w:color w:val="33261A"/>
           <w:sz w:val="23"/>
         </w:rPr>
-        <w:t>POST 18 (T) — Quiz how busy</w:t>
+        <w:t>POST 25 (C) — Deja de traducir Ep4 si o no</w:t>
+      </w:r>
+    </w:p>
+    <w:p>
+      <w:r>
+        <w:rPr>
+          <w:color w:val="8A7A6A"/>
+          <w:sz w:val="20"/>
+        </w:rPr>
+        <w:t>#ingles #aprendeingles #inglesbucaramanga #bucaramanga #academiadeingles</w:t>
+      </w:r>
+    </w:p>
+    <w:p>
+      <w:r>
+        <w:rPr>
+          <w:sz w:val="22"/>
+        </w:rPr>
+        <w:t>¿Cuántas veces dijiste "¿sí o no?" hoy? No es que no sepas inglés — estás traduciendo del español. Guarda el post y repite los reemplazos hoy. Confirmas sin traducir. Deja de traducir · Ep. 4 🎬 ¿Quieres dejar de traducir de verdad? Escríbenos — clase de cortesía.</w:t>
+      </w:r>
+    </w:p>
+    <w:p>
+      <w:r>
+        <w:rPr>
+          <w:b/>
+          <w:color w:val="33261A"/>
+          <w:sz w:val="23"/>
+        </w:rPr>
+        <w:t>POST 26 (T) — Quiz how busy</w:t>
       </w:r>
     </w:p>
     <w:p>
@@ -564,7 +780,142 @@
           <w:color w:val="33261A"/>
           <w:sz w:val="23"/>
         </w:rPr>
-        <w:t>POST 19 (T) — Frase del dia 6</w:t>
+        <w:t>POST 27 (N) — Agencia sin preguntar nivel</w:t>
+      </w:r>
+    </w:p>
+    <w:p>
+      <w:r>
+        <w:rPr>
+          <w:color w:val="8A7A6A"/>
+          <w:sz w:val="20"/>
+        </w:rPr>
+        <w:t>#ingles #aprendeingles #inglesbucaramanga #bucaramanga #academiadeingles</w:t>
+      </w:r>
+    </w:p>
+    <w:p>
+      <w:r>
+        <w:rPr>
+          <w:sz w:val="22"/>
+        </w:rPr>
+        <w:t>Puertas seguras o no se abren: trabajamos solo con operadores establecidos y verificables. Escribe AUPAIR y te mostramos la diferencia.</w:t>
+      </w:r>
+    </w:p>
+    <w:p>
+      <w:r>
+        <w:rPr>
+          <w:b/>
+          <w:color w:val="33261A"/>
+          <w:sz w:val="23"/>
+        </w:rPr>
+        <w:t>POST 28 (T) — Frase del dia 5</w:t>
+      </w:r>
+    </w:p>
+    <w:p>
+      <w:r>
+        <w:rPr>
+          <w:color w:val="8A7A6A"/>
+          <w:sz w:val="20"/>
+        </w:rPr>
+        <w:t>#ingles #aprendeingles #inglesbucaramanga #bucaramanga #academiadeingles</w:t>
+      </w:r>
+    </w:p>
+    <w:p>
+      <w:r>
+        <w:rPr>
+          <w:sz w:val="22"/>
+        </w:rPr>
+        <w:t>Ese DO no está de adorno: es énfasis. Nivel desbloqueado.</w:t>
+      </w:r>
+    </w:p>
+    <w:p>
+      <w:r>
+        <w:rPr>
+          <w:b/>
+          <w:color w:val="33261A"/>
+          <w:sz w:val="23"/>
+        </w:rPr>
+        <w:t>POST 29 (C) — Deja de traducir Ep5 ay no</w:t>
+      </w:r>
+    </w:p>
+    <w:p>
+      <w:r>
+        <w:rPr>
+          <w:color w:val="8A7A6A"/>
+          <w:sz w:val="20"/>
+        </w:rPr>
+        <w:t>#ingles #aprendeingles #inglesbucaramanga #bucaramanga #academiadeingles</w:t>
+      </w:r>
+    </w:p>
+    <w:p>
+      <w:r>
+        <w:rPr>
+          <w:sz w:val="22"/>
+        </w:rPr>
+        <w:t>¿Cuántas veces dijiste "ay no" hoy? No es que no sepas inglés — estás traduciendo del español. Guarda el post y repite los reemplazos hoy. La emoción es lo último que se deja de traducir. Deja de traducir · Ep. 5 🎬 ¿Quieres dejar de traducir de verdad? Escríbenos — clase de cortesía.</w:t>
+      </w:r>
+    </w:p>
+    <w:p>
+      <w:r>
+        <w:rPr>
+          <w:b/>
+          <w:color w:val="33261A"/>
+          <w:sz w:val="23"/>
+        </w:rPr>
+        <w:t>POST 30 (T) — Yes I do</w:t>
+      </w:r>
+    </w:p>
+    <w:p>
+      <w:r>
+        <w:rPr>
+          <w:color w:val="8A7A6A"/>
+          <w:sz w:val="20"/>
+        </w:rPr>
+        <w:t>#ingles #aprendeingles #inglesbucaramanga #bucaramanga #academiadeingles</w:t>
+      </w:r>
+    </w:p>
+    <w:p>
+      <w:r>
+        <w:rPr>
+          <w:sz w:val="22"/>
+        </w:rPr>
+        <w:t>La pregunta te regala la respuesta: devuélvele su auxiliar.</w:t>
+      </w:r>
+    </w:p>
+    <w:p>
+      <w:r>
+        <w:rPr>
+          <w:b/>
+          <w:color w:val="33261A"/>
+          <w:sz w:val="23"/>
+        </w:rPr>
+        <w:t>POST 31 (N) — Horario fijo es el metodo</w:t>
+      </w:r>
+    </w:p>
+    <w:p>
+      <w:r>
+        <w:rPr>
+          <w:color w:val="8A7A6A"/>
+          <w:sz w:val="20"/>
+        </w:rPr>
+        <w:t>#ingles #aprendeingles #inglesbucaramanga #bucaramanga #academiadeingles</w:t>
+      </w:r>
+    </w:p>
+    <w:p>
+      <w:r>
+        <w:rPr>
+          <w:sz w:val="22"/>
+        </w:rPr>
+        <w:t>Horario, tarea con fecha, asistencia. Suena exigente porque LO ES — y por eso funciona.</w:t>
+      </w:r>
+    </w:p>
+    <w:p>
+      <w:r>
+        <w:rPr>
+          <w:b/>
+          <w:color w:val="33261A"/>
+          <w:sz w:val="23"/>
+        </w:rPr>
+        <w:t>POST 32 (T) — Frase del dia 6</w:t>
       </w:r>
     </w:p>
     <w:p>
@@ -591,7 +942,7 @@
           <w:color w:val="33261A"/>
           <w:sz w:val="23"/>
         </w:rPr>
-        <w:t>POST 20 (C) — Deja de traducir Ep4 si o no</w:t>
+        <w:t>POST 33 (C) — Deja de traducir Ep6 eso</w:t>
       </w:r>
     </w:p>
     <w:p>
@@ -608,7 +959,7 @@
         <w:rPr>
           <w:sz w:val="22"/>
         </w:rPr>
-        <w:t>¿Cuántas veces dijiste "¿sí o no?" hoy? No es que no sepas inglés — estás traduciendo del español. Guarda el post y repite los reemplazos hoy. Confirmas sin traducir. Deja de traducir · Ep. 4 🎬 ¿Quieres dejar de traducir de verdad? Escríbenos — clase de cortesía.</w:t>
+        <w:t>¿Cuántas veces dijiste "eso" hoy? No es que no sepas inglés — estás traduciendo del español. Guarda el post y repite los reemplazos hoy. Asientes como nativo, no con subtítulos. Deja de traducir · Ep. 6 🎬 ¿Quieres dejar de traducir de verdad? Escríbenos — clase de cortesía.</w:t>
       </w:r>
     </w:p>
     <w:p>
@@ -618,7 +969,7 @@
           <w:color w:val="33261A"/>
           <w:sz w:val="23"/>
         </w:rPr>
-        <w:t>POST 21 (T) — Yes I do</w:t>
+        <w:t>POST 34 (T) — I love dancING</w:t>
       </w:r>
     </w:p>
     <w:p>
@@ -635,7 +986,7 @@
         <w:rPr>
           <w:sz w:val="22"/>
         </w:rPr>
-        <w:t>La pregunta te regala la respuesta: devuélvele su auxiliar.</w:t>
+        <w:t>Love, like, hate, enjoy… + ING. Ámalo bien.</w:t>
       </w:r>
     </w:p>
     <w:p>
@@ -645,7 +996,34 @@
           <w:color w:val="33261A"/>
           <w:sz w:val="23"/>
         </w:rPr>
-        <w:t>POST 22 (T) — Frase del dia 7</w:t>
+        <w:t>POST 35 (N) — A tu ritmo secreto</w:t>
+      </w:r>
+    </w:p>
+    <w:p>
+      <w:r>
+        <w:rPr>
+          <w:color w:val="8A7A6A"/>
+          <w:sz w:val="20"/>
+        </w:rPr>
+        <w:t>#ingles #aprendeingles #inglesbucaramanga #bucaramanga #academiadeingles</w:t>
+      </w:r>
+    </w:p>
+    <w:p>
+      <w:r>
+        <w:rPr>
+          <w:sz w:val="22"/>
+        </w:rPr>
+        <w:t>La promesa 'a tu ritmo' suena linda hasta que ves las cifras de abandono. Un idioma necesita ritmo — el tuyo, pero sostenido.</w:t>
+      </w:r>
+    </w:p>
+    <w:p>
+      <w:r>
+        <w:rPr>
+          <w:b/>
+          <w:color w:val="33261A"/>
+          <w:sz w:val="23"/>
+        </w:rPr>
+        <w:t>POST 36 (T) — Frase del dia 7</w:t>
       </w:r>
     </w:p>
     <w:p>
@@ -672,7 +1050,7 @@
           <w:color w:val="33261A"/>
           <w:sz w:val="23"/>
         </w:rPr>
-        <w:t>POST 23 (C) — Deja de traducir Ep5 ay no</w:t>
+        <w:t>POST 37 (C) — Deja de traducir Ep7 no se que</w:t>
       </w:r>
     </w:p>
     <w:p>
@@ -689,7 +1067,7 @@
         <w:rPr>
           <w:sz w:val="22"/>
         </w:rPr>
-        <w:t>¿Cuántas veces dijiste "ay no" hoy? No es que no sepas inglés — estás traduciendo del español. Guarda el post y repite los reemplazos hoy. La emoción es lo último que se deja de traducir. Deja de traducir · Ep. 5 🎬 ¿Quieres dejar de traducir de verdad? Escríbenos — clase de cortesía.</w:t>
+        <w:t>¿Cuántas veces dijiste "no sé qué" hoy? No es que no sepas inglés — estás traduciendo del español. Guarda el post y repite los reemplazos hoy. La vaguedad también tiene idioma. Deja de traducir · Ep. 7 🎬 ¿Quieres dejar de traducir de verdad? Escríbenos — clase de cortesía.</w:t>
       </w:r>
     </w:p>
     <w:p>
@@ -699,7 +1077,7 @@
           <w:color w:val="33261A"/>
           <w:sz w:val="23"/>
         </w:rPr>
-        <w:t>POST 24 (T) — I love dancING</w:t>
+        <w:t>POST 38 (T) — she HAS</w:t>
       </w:r>
     </w:p>
     <w:p>
@@ -716,7 +1094,7 @@
         <w:rPr>
           <w:sz w:val="22"/>
         </w:rPr>
-        <w:t>Love, like, hate, enjoy… + ING. Ámalo bien.</w:t>
+        <w:t>He, she, it → has. Fin del misterio.</w:t>
       </w:r>
     </w:p>
     <w:p>
@@ -726,7 +1104,34 @@
           <w:color w:val="33261A"/>
           <w:sz w:val="23"/>
         </w:rPr>
-        <w:t>POST 25 (T) — Frase del dia 8</w:t>
+        <w:t>POST 39 (N) — Tus errores son la proxima clase</w:t>
+      </w:r>
+    </w:p>
+    <w:p>
+      <w:r>
+        <w:rPr>
+          <w:color w:val="8A7A6A"/>
+          <w:sz w:val="20"/>
+        </w:rPr>
+        <w:t>#ingles #aprendeingles #inglesbucaramanga #bucaramanga #academiadeingles</w:t>
+      </w:r>
+    </w:p>
+    <w:p>
+      <w:r>
+        <w:rPr>
+          <w:sz w:val="22"/>
+        </w:rPr>
+        <w:t>Los error papers de cada semana alimentan la clase siguiente. Tu error de hoy es el contenido de mañana — así de en serio nos lo tomamos.</w:t>
+      </w:r>
+    </w:p>
+    <w:p>
+      <w:r>
+        <w:rPr>
+          <w:b/>
+          <w:color w:val="33261A"/>
+          <w:sz w:val="23"/>
+        </w:rPr>
+        <w:t>POST 40 (T) — Frase del dia 8</w:t>
       </w:r>
     </w:p>
     <w:p>
@@ -753,7 +1158,7 @@
           <w:color w:val="33261A"/>
           <w:sz w:val="23"/>
         </w:rPr>
-        <w:t>POST 26 (C) — Deja de traducir Ep6 eso</w:t>
+        <w:t>POST 41 (C) — Deja de traducir Ep8 jajaja</w:t>
       </w:r>
     </w:p>
     <w:p>
@@ -770,7 +1175,7 @@
         <w:rPr>
           <w:sz w:val="22"/>
         </w:rPr>
-        <w:t>¿Cuántas veces dijiste "eso" hoy? No es que no sepas inglés — estás traduciendo del español. Guarda el post y repite los reemplazos hoy. Asientes como nativo, no con subtítulos. Deja de traducir · Ep. 6 🎬 ¿Quieres dejar de traducir de verdad? Escríbenos — clase de cortesía.</w:t>
+        <w:t>¿Cuántas veces dijiste "jajaja" hoy? No es que no sepas inglés — estás traduciendo del español. Guarda el post y repite los reemplazos hoy. Hasta tu risa por chat puede sonar nativa. Deja de traducir · Ep. 8 🎬 ¿Quieres dejar de traducir de verdad? Escríbenos — clase de cortesía.</w:t>
       </w:r>
     </w:p>
     <w:p>
@@ -780,7 +1185,7 @@
           <w:color w:val="33261A"/>
           <w:sz w:val="23"/>
         </w:rPr>
-        <w:t>POST 27 (T) — she HAS</w:t>
+        <w:t>POST 42 (T) — I have GONE</w:t>
       </w:r>
     </w:p>
     <w:p>
@@ -797,7 +1202,7 @@
         <w:rPr>
           <w:sz w:val="22"/>
         </w:rPr>
-        <w:t>He, she, it → has. Fin del misterio.</w:t>
+        <w:t>Go, went, GONE. La tercera columna existe y te está esperando.</w:t>
       </w:r>
     </w:p>
     <w:p>
@@ -807,7 +1212,34 @@
           <w:color w:val="33261A"/>
           <w:sz w:val="23"/>
         </w:rPr>
-        <w:t>POST 28 (T) — Frase del dia 9</w:t>
+        <w:t>POST 43 (N) — Facil y rapido corre</w:t>
+      </w:r>
+    </w:p>
+    <w:p>
+      <w:r>
+        <w:rPr>
+          <w:color w:val="8A7A6A"/>
+          <w:sz w:val="20"/>
+        </w:rPr>
+        <w:t>#ingles #aprendeingles #inglesbucaramanga #bucaramanga #academiadeingles</w:t>
+      </w:r>
+    </w:p>
+    <w:p>
+      <w:r>
+        <w:rPr>
+          <w:sz w:val="22"/>
+        </w:rPr>
+        <w:t>'Fácil y rápido' es marketing. 'Método y horas' es aprendizaje. Elige a quién le crees.</w:t>
+      </w:r>
+    </w:p>
+    <w:p>
+      <w:r>
+        <w:rPr>
+          <w:b/>
+          <w:color w:val="33261A"/>
+          <w:sz w:val="23"/>
+        </w:rPr>
+        <w:t>POST 44 (T) — Frase del dia 9</w:t>
       </w:r>
     </w:p>
     <w:p>
@@ -834,7 +1266,7 @@
           <w:color w:val="33261A"/>
           <w:sz w:val="23"/>
         </w:rPr>
-        <w:t>POST 29 (C) — Deja de traducir Ep7 no se que</w:t>
+        <w:t>POST 45 (T) — pizza WAS delivered</w:t>
       </w:r>
     </w:p>
     <w:p>
@@ -851,7 +1283,7 @@
         <w:rPr>
           <w:sz w:val="22"/>
         </w:rPr>
-        <w:t>¿Cuántas veces dijiste "no sé qué" hoy? No es que no sepas inglés — estás traduciendo del español. Guarda el post y repite los reemplazos hoy. La vaguedad también tiene idioma. Deja de traducir · Ep. 7 🎬 ¿Quieres dejar de traducir de verdad? Escríbenos — clase de cortesía.</w:t>
+        <w:t>Sin 'was', tu pizza tiene vida propia 🍕</w:t>
       </w:r>
     </w:p>
     <w:p>
@@ -861,7 +1293,7 @@
           <w:color w:val="33261A"/>
           <w:sz w:val="23"/>
         </w:rPr>
-        <w:t>POST 30 (T) — I have GONE</w:t>
+        <w:t>POST 46 (N) — Nadie aprende a nadar por videos</w:t>
       </w:r>
     </w:p>
     <w:p>
@@ -878,7 +1310,7 @@
         <w:rPr>
           <w:sz w:val="22"/>
         </w:rPr>
-        <w:t>Go, went, GONE. La tercera columna existe y te está esperando.</w:t>
+        <w:t>Conversación casi todo el tiempo en los niveles avanzados. Al agua desde el día uno — con salvavidas.</w:t>
       </w:r>
     </w:p>
     <w:p>
@@ -888,7 +1320,7 @@
           <w:color w:val="33261A"/>
           <w:sz w:val="23"/>
         </w:rPr>
-        <w:t>POST 31 (T) — Frase del dia 10</w:t>
+        <w:t>POST 47 (T) — Frase del dia 10</w:t>
       </w:r>
     </w:p>
     <w:p>
@@ -915,7 +1347,7 @@
           <w:color w:val="33261A"/>
           <w:sz w:val="23"/>
         </w:rPr>
-        <w:t>POST 32 (C) — Deja de traducir Ep8 jajaja</w:t>
+        <w:t>POST 48 (T) — I saw HER</w:t>
       </w:r>
     </w:p>
     <w:p>
@@ -932,7 +1364,7 @@
         <w:rPr>
           <w:sz w:val="22"/>
         </w:rPr>
-        <w:t>¿Cuántas veces dijiste "jajaja" hoy? No es que no sepas inglés — estás traduciendo del español. Guarda el post y repite los reemplazos hoy. Hasta tu risa por chat puede sonar nativa. Deja de traducir · Ep. 8 🎬 ¿Quieres dejar de traducir de verdad? Escríbenos — clase de cortesía.</w:t>
+        <w:t>Después del verbo: me, you, him, HER, us, them.</w:t>
       </w:r>
     </w:p>
     <w:p>
@@ -942,7 +1374,7 @@
           <w:color w:val="33261A"/>
           <w:sz w:val="23"/>
         </w:rPr>
-        <w:t>POST 33 (T) — pizza WAS delivered</w:t>
+        <w:t>POST 49 (T) — Quiz have gone</w:t>
       </w:r>
     </w:p>
     <w:p>
@@ -959,7 +1391,7 @@
         <w:rPr>
           <w:sz w:val="22"/>
         </w:rPr>
-        <w:t>Sin 'was', tu pizza tiene vida propia 🍕</w:t>
+        <w:t>La respuesta es la B — y si dudaste, este perfil es para ti. ¿Cuál pusiste? 👇</w:t>
       </w:r>
     </w:p>
     <w:p>
@@ -969,7 +1401,7 @@
           <w:color w:val="33261A"/>
           <w:sz w:val="23"/>
         </w:rPr>
-        <w:t>POST 34 (T) — did vs have done</w:t>
+        <w:t>POST 50 (T) — did vs have done</w:t>
       </w:r>
     </w:p>
     <w:p>
@@ -996,7 +1428,7 @@
           <w:color w:val="33261A"/>
           <w:sz w:val="23"/>
         </w:rPr>
-        <w:t>POST 35 (T) — I saw HER</w:t>
+        <w:t>POST 51 (T) — wanna</w:t>
       </w:r>
     </w:p>
     <w:p>
@@ -1013,7 +1445,7 @@
         <w:rPr>
           <w:sz w:val="22"/>
         </w:rPr>
-        <w:t>Después del verbo: me, you, him, HER, us, them.</w:t>
+        <w:t>Wanna, gonna, gotta: el inglés real no habla como tu libro.</w:t>
       </w:r>
     </w:p>
     <w:p>
@@ -1023,34 +1455,7 @@
           <w:color w:val="33261A"/>
           <w:sz w:val="23"/>
         </w:rPr>
-        <w:t>POST 36 (T) — Quiz have gone</w:t>
-      </w:r>
-    </w:p>
-    <w:p>
-      <w:r>
-        <w:rPr>
-          <w:color w:val="8A7A6A"/>
-          <w:sz w:val="20"/>
-        </w:rPr>
-        <w:t>#ingles #aprendeingles #inglesbucaramanga #bucaramanga #academiadeingles</w:t>
-      </w:r>
-    </w:p>
-    <w:p>
-      <w:r>
-        <w:rPr>
-          <w:sz w:val="22"/>
-        </w:rPr>
-        <w:t>La respuesta es la B — y si dudaste, este perfil es para ti. ¿Cuál pusiste? 👇</w:t>
-      </w:r>
-    </w:p>
-    <w:p>
-      <w:r>
-        <w:rPr>
-          <w:b/>
-          <w:color w:val="33261A"/>
-          <w:sz w:val="23"/>
-        </w:rPr>
-        <w:t>POST 37 (T) — closed vs open time</w:t>
+        <w:t>POST 52 (T) — closed vs open time</w:t>
       </w:r>
     </w:p>
     <w:p>
@@ -1077,34 +1482,7 @@
           <w:color w:val="33261A"/>
           <w:sz w:val="23"/>
         </w:rPr>
-        <w:t>POST 38 (T) — wanna</w:t>
-      </w:r>
-    </w:p>
-    <w:p>
-      <w:r>
-        <w:rPr>
-          <w:color w:val="8A7A6A"/>
-          <w:sz w:val="20"/>
-        </w:rPr>
-        <w:t>#ingles #aprendeingles #inglesbucaramanga #bucaramanga #academiadeingles</w:t>
-      </w:r>
-    </w:p>
-    <w:p>
-      <w:r>
-        <w:rPr>
-          <w:sz w:val="22"/>
-        </w:rPr>
-        <w:t>Wanna, gonna, gotta: el inglés real no habla como tu libro.</w:t>
-      </w:r>
-    </w:p>
-    <w:p>
-      <w:r>
-        <w:rPr>
-          <w:b/>
-          <w:color w:val="33261A"/>
-          <w:sz w:val="23"/>
-        </w:rPr>
-        <w:t>POST 39 (T) — I DONT like</w:t>
+        <w:t>POST 53 (T) — I DONT like</w:t>
       </w:r>
     </w:p>
     <w:p>
@@ -1131,7 +1509,7 @@
           <w:color w:val="33261A"/>
           <w:sz w:val="23"/>
         </w:rPr>
-        <w:t>POST 40 (T) — ITs raining</w:t>
+        <w:t>POST 54 (T) — ITs raining</w:t>
       </w:r>
     </w:p>
     <w:p>
@@ -1158,7 +1536,7 @@
           <w:color w:val="33261A"/>
           <w:sz w:val="23"/>
         </w:rPr>
-        <w:t>POST 41 (T) — Cierre de mes</w:t>
+        <w:t>POST 55 (T) — Cierre de mes</w:t>
       </w:r>
     </w:p>
     <w:p>

</xml_diff>

<commit_message>
Copies Heiiu: ritmo definitivo 3 posts/dia con separadores DIA 1-19
Co-Authored-By: Claude Fable 5 <noreply@anthropic.com>
</commit_message>
<xml_diff>
--- a/recursos/comercial/campañas/IG_HEIIU/COPIES_HEIIU.docx
+++ b/recursos/comercial/campañas/IG_HEIIU/COPIES_HEIIU.docx
@@ -38,7 +38,7 @@
           <w:color w:val="8A7A6A"/>
           <w:sz w:val="19"/>
         </w:rPr>
-        <w:t>Cuenta activa: ritmo 1-2 piezas/día los primeros 3 días y luego 1/día programada (Metricool). Los Au Pair van temprano: la promo $2.990.000 vence el 31/08.</w:t>
+        <w:t>RITMO: 3 publicaciones por día (mañana · mediodía · tarde-noche), en el orden exacto de los números. Los Au Pair van temprano: la promo $2.990.000 vence el 31/08.</w:t>
       </w:r>
     </w:p>
     <w:p>
@@ -48,7 +48,7 @@
           <w:color w:val="E54C09"/>
           <w:sz w:val="25"/>
         </w:rPr>
-        <w:t>ARRANQUE (esta semana) — POST 01 a 06: incluye los 2 primeros Au Pair por la promo</w:t>
+        <w:t>DÍA 1 — publicar estos 3 (mañana · mediodía · tarde)</w:t>
       </w:r>
     </w:p>
     <w:p>
@@ -130,6 +130,16 @@
           <w:sz w:val="22"/>
         </w:rPr>
         <w:t>El 88% abandona la app antes del primer mes (retención día 30 de Duolingo: 12% — Udonis). La flexibilidad vende; el compromiso enseña. Si buscas hablar de verdad, escríbenos.</w:t>
+      </w:r>
+    </w:p>
+    <w:p>
+      <w:r>
+        <w:rPr>
+          <w:b/>
+          <w:color w:val="E54C09"/>
+          <w:sz w:val="25"/>
+        </w:rPr>
+        <w:t>DÍA 2 — publicar estos 3 (mañana · mediodía · tarde)</w:t>
       </w:r>
     </w:p>
     <w:p>
@@ -220,7 +230,7 @@
           <w:color w:val="E54C09"/>
           <w:sz w:val="25"/>
         </w:rPr>
-        <w:t>SEMANA 2 — POST 07 a 15 (AuPair ruta + FAQ dentro de la ventana de promo)</w:t>
+        <w:t>DÍA 3 — publicar estos 3 (mañana · mediodía · tarde)</w:t>
       </w:r>
     </w:p>
     <w:p>
@@ -308,6 +318,16 @@
       <w:r>
         <w:rPr>
           <w:b/>
+          <w:color w:val="E54C09"/>
+          <w:sz w:val="25"/>
+        </w:rPr>
+        <w:t>DÍA 4 — publicar estos 3 (mañana · mediodía · tarde)</w:t>
+      </w:r>
+    </w:p>
+    <w:p>
+      <w:r>
+        <w:rPr>
+          <w:b/>
           <w:color w:val="33261A"/>
           <w:sz w:val="23"/>
         </w:rPr>
@@ -383,6 +403,16 @@
           <w:sz w:val="22"/>
         </w:rPr>
         <w:t>¿Cuántas veces dijiste "o sea" hoy? No es que no sepas inglés — estás traduciendo del español. Guarda el post y repite los reemplazos hoy. Aclaras como nativo, no como diccionario. Deja de traducir · Ep. 2 🎬 ¿Quieres dejar de traducir de verdad? Escríbenos — clase de cortesía.</w:t>
+      </w:r>
+    </w:p>
+    <w:p>
+      <w:r>
+        <w:rPr>
+          <w:b/>
+          <w:color w:val="E54C09"/>
+          <w:sz w:val="25"/>
+        </w:rPr>
+        <w:t>DÍA 5 — publicar estos 3 (mañana · mediodía · tarde)</w:t>
       </w:r>
     </w:p>
     <w:p>
@@ -473,7 +503,7 @@
           <w:color w:val="E54C09"/>
           <w:sz w:val="25"/>
         </w:rPr>
-        <w:t>RÉGIMEN — POST 16 en adelante: 1 por día programada</w:t>
+        <w:t>DÍA 6 — publicar estos 3 (mañana · mediodía · tarde)</w:t>
       </w:r>
     </w:p>
     <w:p>
@@ -561,6 +591,16 @@
       <w:r>
         <w:rPr>
           <w:b/>
+          <w:color w:val="E54C09"/>
+          <w:sz w:val="25"/>
+        </w:rPr>
+        <w:t>DÍA 7 — publicar estos 3 (mañana · mediodía · tarde)</w:t>
+      </w:r>
+    </w:p>
+    <w:p>
+      <w:r>
+        <w:rPr>
+          <w:b/>
           <w:color w:val="33261A"/>
           <w:sz w:val="23"/>
         </w:rPr>
@@ -636,6 +676,16 @@
           <w:sz w:val="22"/>
         </w:rPr>
         <w:t>¿Cuántas veces dijiste "listo" hoy? No es que no sepas inglés — estás traduciendo del español. Guarda el post y repite los reemplazos hoy. Cierras conversaciones como nativo. Deja de traducir · Ep. 3 🎬 ¿Quieres dejar de traducir de verdad? Escríbenos — clase de cortesía.</w:t>
+      </w:r>
+    </w:p>
+    <w:p>
+      <w:r>
+        <w:rPr>
+          <w:b/>
+          <w:color w:val="E54C09"/>
+          <w:sz w:val="25"/>
+        </w:rPr>
+        <w:t>DÍA 8 — publicar estos 3 (mañana · mediodía · tarde)</w:t>
       </w:r>
     </w:p>
     <w:p>
@@ -723,6 +773,16 @@
       <w:r>
         <w:rPr>
           <w:b/>
+          <w:color w:val="E54C09"/>
+          <w:sz w:val="25"/>
+        </w:rPr>
+        <w:t>DÍA 9 — publicar estos 3 (mañana · mediodía · tarde)</w:t>
+      </w:r>
+    </w:p>
+    <w:p>
+      <w:r>
+        <w:rPr>
+          <w:b/>
           <w:color w:val="33261A"/>
           <w:sz w:val="23"/>
         </w:rPr>
@@ -798,6 +858,16 @@
           <w:sz w:val="22"/>
         </w:rPr>
         <w:t>Puertas seguras o no se abren: trabajamos solo con operadores establecidos y verificables. Escribe AUPAIR y te mostramos la diferencia.</w:t>
+      </w:r>
+    </w:p>
+    <w:p>
+      <w:r>
+        <w:rPr>
+          <w:b/>
+          <w:color w:val="E54C09"/>
+          <w:sz w:val="25"/>
+        </w:rPr>
+        <w:t>DÍA 10 — publicar estos 3 (mañana · mediodía · tarde)</w:t>
       </w:r>
     </w:p>
     <w:p>
@@ -885,6 +955,16 @@
       <w:r>
         <w:rPr>
           <w:b/>
+          <w:color w:val="E54C09"/>
+          <w:sz w:val="25"/>
+        </w:rPr>
+        <w:t>DÍA 11 — publicar estos 3 (mañana · mediodía · tarde)</w:t>
+      </w:r>
+    </w:p>
+    <w:p>
+      <w:r>
+        <w:rPr>
+          <w:b/>
           <w:color w:val="33261A"/>
           <w:sz w:val="23"/>
         </w:rPr>
@@ -960,6 +1040,16 @@
           <w:sz w:val="22"/>
         </w:rPr>
         <w:t>¿Cuántas veces dijiste "eso" hoy? No es que no sepas inglés — estás traduciendo del español. Guarda el post y repite los reemplazos hoy. Asientes como nativo, no con subtítulos. Deja de traducir · Ep. 6 🎬 ¿Quieres dejar de traducir de verdad? Escríbenos — clase de cortesía.</w:t>
+      </w:r>
+    </w:p>
+    <w:p>
+      <w:r>
+        <w:rPr>
+          <w:b/>
+          <w:color w:val="E54C09"/>
+          <w:sz w:val="25"/>
+        </w:rPr>
+        <w:t>DÍA 12 — publicar estos 3 (mañana · mediodía · tarde)</w:t>
       </w:r>
     </w:p>
     <w:p>
@@ -1047,6 +1137,16 @@
       <w:r>
         <w:rPr>
           <w:b/>
+          <w:color w:val="E54C09"/>
+          <w:sz w:val="25"/>
+        </w:rPr>
+        <w:t>DÍA 13 — publicar estos 3 (mañana · mediodía · tarde)</w:t>
+      </w:r>
+    </w:p>
+    <w:p>
+      <w:r>
+        <w:rPr>
+          <w:b/>
           <w:color w:val="33261A"/>
           <w:sz w:val="23"/>
         </w:rPr>
@@ -1122,6 +1222,16 @@
           <w:sz w:val="22"/>
         </w:rPr>
         <w:t>Los error papers de cada semana alimentan la clase siguiente. Tu error de hoy es el contenido de mañana — así de en serio nos lo tomamos.</w:t>
+      </w:r>
+    </w:p>
+    <w:p>
+      <w:r>
+        <w:rPr>
+          <w:b/>
+          <w:color w:val="E54C09"/>
+          <w:sz w:val="25"/>
+        </w:rPr>
+        <w:t>DÍA 14 — publicar estos 3 (mañana · mediodía · tarde)</w:t>
       </w:r>
     </w:p>
     <w:p>
@@ -1209,6 +1319,16 @@
       <w:r>
         <w:rPr>
           <w:b/>
+          <w:color w:val="E54C09"/>
+          <w:sz w:val="25"/>
+        </w:rPr>
+        <w:t>DÍA 15 — publicar estos 3 (mañana · mediodía · tarde)</w:t>
+      </w:r>
+    </w:p>
+    <w:p>
+      <w:r>
+        <w:rPr>
+          <w:b/>
           <w:color w:val="33261A"/>
           <w:sz w:val="23"/>
         </w:rPr>
@@ -1284,6 +1404,16 @@
           <w:sz w:val="22"/>
         </w:rPr>
         <w:t>Sin 'was', tu pizza tiene vida propia 🍕</w:t>
+      </w:r>
+    </w:p>
+    <w:p>
+      <w:r>
+        <w:rPr>
+          <w:b/>
+          <w:color w:val="E54C09"/>
+          <w:sz w:val="25"/>
+        </w:rPr>
+        <w:t>DÍA 16 — publicar estos 3 (mañana · mediodía · tarde)</w:t>
       </w:r>
     </w:p>
     <w:p>
@@ -1371,6 +1501,16 @@
       <w:r>
         <w:rPr>
           <w:b/>
+          <w:color w:val="E54C09"/>
+          <w:sz w:val="25"/>
+        </w:rPr>
+        <w:t>DÍA 17 — publicar estos 3 (mañana · mediodía · tarde)</w:t>
+      </w:r>
+    </w:p>
+    <w:p>
+      <w:r>
+        <w:rPr>
+          <w:b/>
           <w:color w:val="33261A"/>
           <w:sz w:val="23"/>
         </w:rPr>
@@ -1452,6 +1592,16 @@
       <w:r>
         <w:rPr>
           <w:b/>
+          <w:color w:val="E54C09"/>
+          <w:sz w:val="25"/>
+        </w:rPr>
+        <w:t>DÍA 18 — publicar estos 3 (mañana · mediodía · tarde)</w:t>
+      </w:r>
+    </w:p>
+    <w:p>
+      <w:r>
+        <w:rPr>
+          <w:b/>
           <w:color w:val="33261A"/>
           <w:sz w:val="23"/>
         </w:rPr>
@@ -1527,6 +1677,16 @@
           <w:sz w:val="22"/>
         </w:rPr>
         <w:t>En inglés hasta la lluvia necesita sujeto.</w:t>
+      </w:r>
+    </w:p>
+    <w:p>
+      <w:r>
+        <w:rPr>
+          <w:b/>
+          <w:color w:val="E54C09"/>
+          <w:sz w:val="25"/>
+        </w:rPr>
+        <w:t>DÍA 19 — publicar estos 3 (mañana · mediodía · tarde)</w:t>
       </w:r>
     </w:p>
     <w:p>

</xml_diff>